<commit_message>
Changed delete by id logic for safe delete
</commit_message>
<xml_diff>
--- a/Documentation/APIs Docs 2.0/Skill Matrix 2.0 API Documentation.docx
+++ b/Documentation/APIs Docs 2.0/Skill Matrix 2.0 API Documentation.docx
@@ -95,7 +95,7 @@
           <w:lang w:eastAsia="en-IN"/>
           <w14:ligatures w14:val="none"/>
         </w:rPr>
-        <w:pict>
+        <w:pict w14:anchorId="2C76A605">
           <v:rect id="_x0000_i1025" style="width:0;height:1.5pt" o:hralign="center" o:hrstd="t" o:hr="t" fillcolor="#a0a0a0" stroked="f"/>
         </w:pict>
       </w:r>
@@ -187,7 +187,7 @@
           <w:lang w:eastAsia="en-IN"/>
           <w14:ligatures w14:val="none"/>
         </w:rPr>
-        <w:pict>
+        <w:pict w14:anchorId="5ECBD67F">
           <v:rect id="_x0000_i1026" style="width:0;height:1.5pt" o:hralign="center" o:hrstd="t" o:hr="t" fillcolor="#a0a0a0" stroked="f"/>
         </w:pict>
       </w:r>
@@ -297,7 +297,7 @@
           <w:lang w:eastAsia="en-IN"/>
           <w14:ligatures w14:val="none"/>
         </w:rPr>
-        <w:pict>
+        <w:pict w14:anchorId="4CF0A751">
           <v:rect id="_x0000_i1027" style="width:0;height:1.5pt" o:hralign="center" o:hrstd="t" o:hr="t" fillcolor="#a0a0a0" stroked="f"/>
         </w:pict>
       </w:r>
@@ -581,7 +581,6 @@
           <w14:ligatures w14:val="none"/>
         </w:rPr>
       </w:pPr>
-      <w:proofErr w:type="spellStart"/>
       <w:r>
         <w:rPr>
           <w:rFonts w:ascii="Courier New" w:eastAsia="Times New Roman" w:hAnsi="Courier New" w:cs="Courier New"/>
@@ -593,7 +592,6 @@
         </w:rPr>
         <w:t>machineCode</w:t>
       </w:r>
-      <w:proofErr w:type="spellEnd"/>
       <w:r>
         <w:rPr>
           <w:rFonts w:ascii="Times New Roman" w:eastAsia="Times New Roman" w:hAnsi="Times New Roman" w:cs="Times New Roman"/>
@@ -701,7 +699,6 @@
         </w:rPr>
         <w:t xml:space="preserve">, </w:t>
       </w:r>
-      <w:proofErr w:type="spellStart"/>
       <w:r>
         <w:rPr>
           <w:rFonts w:ascii="Courier New" w:eastAsia="Times New Roman" w:hAnsi="Courier New" w:cs="Courier New"/>
@@ -713,7 +710,6 @@
         </w:rPr>
         <w:t>png</w:t>
       </w:r>
-      <w:proofErr w:type="spellEnd"/>
       <w:r>
         <w:rPr>
           <w:rFonts w:ascii="Times New Roman" w:eastAsia="Times New Roman" w:hAnsi="Times New Roman" w:cs="Times New Roman"/>
@@ -962,7 +958,6 @@
         </w:rPr>
         <w:t xml:space="preserve">: </w:t>
       </w:r>
-      <w:proofErr w:type="spellStart"/>
       <w:r>
         <w:rPr>
           <w:rFonts w:ascii="Courier New" w:eastAsia="Times New Roman" w:hAnsi="Courier New" w:cs="Courier New"/>
@@ -974,7 +969,6 @@
         </w:rPr>
         <w:t>Skill_Matrix_Set_A</w:t>
       </w:r>
-      <w:proofErr w:type="spellEnd"/>
     </w:p>
     <w:p>
       <w:pPr>
@@ -992,7 +986,6 @@
           <w14:ligatures w14:val="none"/>
         </w:rPr>
       </w:pPr>
-      <w:proofErr w:type="spellStart"/>
       <w:r>
         <w:rPr>
           <w:rFonts w:ascii="Courier New" w:eastAsia="Times New Roman" w:hAnsi="Courier New" w:cs="Courier New"/>
@@ -1004,7 +997,6 @@
         </w:rPr>
         <w:t>machineCode</w:t>
       </w:r>
-      <w:proofErr w:type="spellEnd"/>
       <w:r>
         <w:rPr>
           <w:rFonts w:ascii="Times New Roman" w:eastAsia="Times New Roman" w:hAnsi="Times New Roman" w:cs="Times New Roman"/>
@@ -1358,31 +1350,7 @@
           <w:lang w:eastAsia="en-IN"/>
           <w14:ligatures w14:val="none"/>
         </w:rPr>
-        <w:t xml:space="preserve">      "name": "</w:t>
-      </w:r>
-      <w:proofErr w:type="spellStart"/>
-      <w:r>
-        <w:rPr>
-          <w:rFonts w:ascii="Courier New" w:eastAsia="Times New Roman" w:hAnsi="Courier New" w:cs="Courier New"/>
-          <w:kern w:val="0"/>
-          <w:sz w:val="20"/>
-          <w:szCs w:val="20"/>
-          <w:lang w:eastAsia="en-IN"/>
-          <w14:ligatures w14:val="none"/>
-        </w:rPr>
-        <w:t>Skill_Matrix_Set_A</w:t>
-      </w:r>
-      <w:proofErr w:type="spellEnd"/>
-      <w:r>
-        <w:rPr>
-          <w:rFonts w:ascii="Courier New" w:eastAsia="Times New Roman" w:hAnsi="Courier New" w:cs="Courier New"/>
-          <w:kern w:val="0"/>
-          <w:sz w:val="20"/>
-          <w:szCs w:val="20"/>
-          <w:lang w:eastAsia="en-IN"/>
-          <w14:ligatures w14:val="none"/>
-        </w:rPr>
-        <w:t>",</w:t>
+        <w:t xml:space="preserve">      "name": "Skill_Matrix_Set_A",</w:t>
       </w:r>
     </w:p>
     <w:p>
@@ -1424,31 +1392,7 @@
           <w:lang w:eastAsia="en-IN"/>
           <w14:ligatures w14:val="none"/>
         </w:rPr>
-        <w:t xml:space="preserve">      "</w:t>
-      </w:r>
-      <w:proofErr w:type="spellStart"/>
-      <w:r>
-        <w:rPr>
-          <w:rFonts w:ascii="Courier New" w:eastAsia="Times New Roman" w:hAnsi="Courier New" w:cs="Courier New"/>
-          <w:kern w:val="0"/>
-          <w:sz w:val="20"/>
-          <w:szCs w:val="20"/>
-          <w:lang w:eastAsia="en-IN"/>
-          <w14:ligatures w14:val="none"/>
-        </w:rPr>
-        <w:t>machineCode</w:t>
-      </w:r>
-      <w:proofErr w:type="spellEnd"/>
-      <w:r>
-        <w:rPr>
-          <w:rFonts w:ascii="Courier New" w:eastAsia="Times New Roman" w:hAnsi="Courier New" w:cs="Courier New"/>
-          <w:kern w:val="0"/>
-          <w:sz w:val="20"/>
-          <w:szCs w:val="20"/>
-          <w:lang w:eastAsia="en-IN"/>
-          <w14:ligatures w14:val="none"/>
-        </w:rPr>
-        <w:t>": "MACHINE001",</w:t>
+        <w:t xml:space="preserve">      "machineCode": "MACHINE001",</w:t>
       </w:r>
     </w:p>
     <w:p>
@@ -1490,55 +1434,7 @@
           <w:lang w:eastAsia="en-IN"/>
           <w14:ligatures w14:val="none"/>
         </w:rPr>
-        <w:t xml:space="preserve">      "</w:t>
-      </w:r>
-      <w:proofErr w:type="spellStart"/>
-      <w:r>
-        <w:rPr>
-          <w:rFonts w:ascii="Courier New" w:eastAsia="Times New Roman" w:hAnsi="Courier New" w:cs="Courier New"/>
-          <w:kern w:val="0"/>
-          <w:sz w:val="20"/>
-          <w:szCs w:val="20"/>
-          <w:lang w:eastAsia="en-IN"/>
-          <w14:ligatures w14:val="none"/>
-        </w:rPr>
-        <w:t>imagePath</w:t>
-      </w:r>
-      <w:proofErr w:type="spellEnd"/>
-      <w:r>
-        <w:rPr>
-          <w:rFonts w:ascii="Courier New" w:eastAsia="Times New Roman" w:hAnsi="Courier New" w:cs="Courier New"/>
-          <w:kern w:val="0"/>
-          <w:sz w:val="20"/>
-          <w:szCs w:val="20"/>
-          <w:lang w:eastAsia="en-IN"/>
-          <w14:ligatures w14:val="none"/>
-        </w:rPr>
-        <w:t>": "uploads/</w:t>
-      </w:r>
-      <w:proofErr w:type="spellStart"/>
-      <w:r>
-        <w:rPr>
-          <w:rFonts w:ascii="Courier New" w:eastAsia="Times New Roman" w:hAnsi="Courier New" w:cs="Courier New"/>
-          <w:kern w:val="0"/>
-          <w:sz w:val="20"/>
-          <w:szCs w:val="20"/>
-          <w:lang w:eastAsia="en-IN"/>
-          <w14:ligatures w14:val="none"/>
-        </w:rPr>
-        <w:t>skillmatrix</w:t>
-      </w:r>
-      <w:proofErr w:type="spellEnd"/>
-      <w:r>
-        <w:rPr>
-          <w:rFonts w:ascii="Courier New" w:eastAsia="Times New Roman" w:hAnsi="Courier New" w:cs="Courier New"/>
-          <w:kern w:val="0"/>
-          <w:sz w:val="20"/>
-          <w:szCs w:val="20"/>
-          <w:lang w:eastAsia="en-IN"/>
-          <w14:ligatures w14:val="none"/>
-        </w:rPr>
-        <w:t>/1716553364110_image1.jpg",</w:t>
+        <w:t xml:space="preserve">      "imagePath": "uploads/skillmatrix/1716553364110_image1.jpg",</w:t>
       </w:r>
     </w:p>
     <w:p>
@@ -1580,31 +1476,7 @@
           <w:lang w:eastAsia="en-IN"/>
           <w14:ligatures w14:val="none"/>
         </w:rPr>
-        <w:t xml:space="preserve">      "</w:t>
-      </w:r>
-      <w:proofErr w:type="spellStart"/>
-      <w:r>
-        <w:rPr>
-          <w:rFonts w:ascii="Courier New" w:eastAsia="Times New Roman" w:hAnsi="Courier New" w:cs="Courier New"/>
-          <w:kern w:val="0"/>
-          <w:sz w:val="20"/>
-          <w:szCs w:val="20"/>
-          <w:lang w:eastAsia="en-IN"/>
-          <w14:ligatures w14:val="none"/>
-        </w:rPr>
-        <w:t>createdAt</w:t>
-      </w:r>
-      <w:proofErr w:type="spellEnd"/>
-      <w:r>
-        <w:rPr>
-          <w:rFonts w:ascii="Courier New" w:eastAsia="Times New Roman" w:hAnsi="Courier New" w:cs="Courier New"/>
-          <w:kern w:val="0"/>
-          <w:sz w:val="20"/>
-          <w:szCs w:val="20"/>
-          <w:lang w:eastAsia="en-IN"/>
-          <w14:ligatures w14:val="none"/>
-        </w:rPr>
-        <w:t>": "2024-05-24T10:22:44.136Z",</w:t>
+        <w:t xml:space="preserve">      "createdAt": "2024-05-24T10:22:44.136Z",</w:t>
       </w:r>
     </w:p>
     <w:p>
@@ -1797,7 +1669,7 @@
           <w:lang w:eastAsia="en-IN"/>
           <w14:ligatures w14:val="none"/>
         </w:rPr>
-        <w:pict>
+        <w:pict w14:anchorId="474FBED1">
           <v:rect id="_x0000_i1028" style="width:0;height:1.5pt" o:hralign="center" o:hrstd="t" o:hr="t" fillcolor="#a0a0a0" stroked="f"/>
         </w:pict>
       </w:r>
@@ -1996,7 +1868,6 @@
           <w14:ligatures w14:val="none"/>
         </w:rPr>
       </w:pPr>
-      <w:proofErr w:type="spellStart"/>
       <w:r>
         <w:rPr>
           <w:rFonts w:ascii="Courier New" w:eastAsia="Times New Roman" w:hAnsi="Courier New" w:cs="Courier New"/>
@@ -2008,7 +1879,6 @@
         </w:rPr>
         <w:t>machineCode</w:t>
       </w:r>
-      <w:proofErr w:type="spellEnd"/>
       <w:r>
         <w:rPr>
           <w:rFonts w:ascii="Times New Roman" w:eastAsia="Times New Roman" w:hAnsi="Times New Roman" w:cs="Times New Roman"/>
@@ -2354,31 +2224,7 @@
           <w:lang w:eastAsia="en-IN"/>
           <w14:ligatures w14:val="none"/>
         </w:rPr>
-        <w:t xml:space="preserve">    "name": "</w:t>
-      </w:r>
-      <w:proofErr w:type="spellStart"/>
-      <w:r>
-        <w:rPr>
-          <w:rFonts w:ascii="Courier New" w:eastAsia="Times New Roman" w:hAnsi="Courier New" w:cs="Courier New"/>
-          <w:kern w:val="0"/>
-          <w:sz w:val="20"/>
-          <w:szCs w:val="20"/>
-          <w:lang w:eastAsia="en-IN"/>
-          <w14:ligatures w14:val="none"/>
-        </w:rPr>
-        <w:t>Skill_Matrix_Set_A</w:t>
-      </w:r>
-      <w:proofErr w:type="spellEnd"/>
-      <w:r>
-        <w:rPr>
-          <w:rFonts w:ascii="Courier New" w:eastAsia="Times New Roman" w:hAnsi="Courier New" w:cs="Courier New"/>
-          <w:kern w:val="0"/>
-          <w:sz w:val="20"/>
-          <w:szCs w:val="20"/>
-          <w:lang w:eastAsia="en-IN"/>
-          <w14:ligatures w14:val="none"/>
-        </w:rPr>
-        <w:t>",</w:t>
+        <w:t xml:space="preserve">    "name": "Skill_Matrix_Set_A",</w:t>
       </w:r>
     </w:p>
     <w:p>
@@ -2420,31 +2266,7 @@
           <w:lang w:eastAsia="en-IN"/>
           <w14:ligatures w14:val="none"/>
         </w:rPr>
-        <w:t xml:space="preserve">    "</w:t>
-      </w:r>
-      <w:proofErr w:type="spellStart"/>
-      <w:r>
-        <w:rPr>
-          <w:rFonts w:ascii="Courier New" w:eastAsia="Times New Roman" w:hAnsi="Courier New" w:cs="Courier New"/>
-          <w:kern w:val="0"/>
-          <w:sz w:val="20"/>
-          <w:szCs w:val="20"/>
-          <w:lang w:eastAsia="en-IN"/>
-          <w14:ligatures w14:val="none"/>
-        </w:rPr>
-        <w:t>machineCode</w:t>
-      </w:r>
-      <w:proofErr w:type="spellEnd"/>
-      <w:r>
-        <w:rPr>
-          <w:rFonts w:ascii="Courier New" w:eastAsia="Times New Roman" w:hAnsi="Courier New" w:cs="Courier New"/>
-          <w:kern w:val="0"/>
-          <w:sz w:val="20"/>
-          <w:szCs w:val="20"/>
-          <w:lang w:eastAsia="en-IN"/>
-          <w14:ligatures w14:val="none"/>
-        </w:rPr>
-        <w:t>": "MACHINE001",</w:t>
+        <w:t xml:space="preserve">    "machineCode": "MACHINE001",</w:t>
       </w:r>
     </w:p>
     <w:p>
@@ -2486,55 +2308,7 @@
           <w:lang w:eastAsia="en-IN"/>
           <w14:ligatures w14:val="none"/>
         </w:rPr>
-        <w:t xml:space="preserve">    "</w:t>
-      </w:r>
-      <w:proofErr w:type="spellStart"/>
-      <w:r>
-        <w:rPr>
-          <w:rFonts w:ascii="Courier New" w:eastAsia="Times New Roman" w:hAnsi="Courier New" w:cs="Courier New"/>
-          <w:kern w:val="0"/>
-          <w:sz w:val="20"/>
-          <w:szCs w:val="20"/>
-          <w:lang w:eastAsia="en-IN"/>
-          <w14:ligatures w14:val="none"/>
-        </w:rPr>
-        <w:t>imagePath</w:t>
-      </w:r>
-      <w:proofErr w:type="spellEnd"/>
-      <w:r>
-        <w:rPr>
-          <w:rFonts w:ascii="Courier New" w:eastAsia="Times New Roman" w:hAnsi="Courier New" w:cs="Courier New"/>
-          <w:kern w:val="0"/>
-          <w:sz w:val="20"/>
-          <w:szCs w:val="20"/>
-          <w:lang w:eastAsia="en-IN"/>
-          <w14:ligatures w14:val="none"/>
-        </w:rPr>
-        <w:t>": "uploads/</w:t>
-      </w:r>
-      <w:proofErr w:type="spellStart"/>
-      <w:r>
-        <w:rPr>
-          <w:rFonts w:ascii="Courier New" w:eastAsia="Times New Roman" w:hAnsi="Courier New" w:cs="Courier New"/>
-          <w:kern w:val="0"/>
-          <w:sz w:val="20"/>
-          <w:szCs w:val="20"/>
-          <w:lang w:eastAsia="en-IN"/>
-          <w14:ligatures w14:val="none"/>
-        </w:rPr>
-        <w:t>skillmatrix</w:t>
-      </w:r>
-      <w:proofErr w:type="spellEnd"/>
-      <w:r>
-        <w:rPr>
-          <w:rFonts w:ascii="Courier New" w:eastAsia="Times New Roman" w:hAnsi="Courier New" w:cs="Courier New"/>
-          <w:kern w:val="0"/>
-          <w:sz w:val="20"/>
-          <w:szCs w:val="20"/>
-          <w:lang w:eastAsia="en-IN"/>
-          <w14:ligatures w14:val="none"/>
-        </w:rPr>
-        <w:t>/1716553364110_image1.jpg",</w:t>
+        <w:t xml:space="preserve">    "imagePath": "uploads/skillmatrix/1716553364110_image1.jpg",</w:t>
       </w:r>
     </w:p>
     <w:p>
@@ -2576,31 +2350,7 @@
           <w:lang w:eastAsia="en-IN"/>
           <w14:ligatures w14:val="none"/>
         </w:rPr>
-        <w:t xml:space="preserve">    "</w:t>
-      </w:r>
-      <w:proofErr w:type="spellStart"/>
-      <w:r>
-        <w:rPr>
-          <w:rFonts w:ascii="Courier New" w:eastAsia="Times New Roman" w:hAnsi="Courier New" w:cs="Courier New"/>
-          <w:kern w:val="0"/>
-          <w:sz w:val="20"/>
-          <w:szCs w:val="20"/>
-          <w:lang w:eastAsia="en-IN"/>
-          <w14:ligatures w14:val="none"/>
-        </w:rPr>
-        <w:t>createdAt</w:t>
-      </w:r>
-      <w:proofErr w:type="spellEnd"/>
-      <w:r>
-        <w:rPr>
-          <w:rFonts w:ascii="Courier New" w:eastAsia="Times New Roman" w:hAnsi="Courier New" w:cs="Courier New"/>
-          <w:kern w:val="0"/>
-          <w:sz w:val="20"/>
-          <w:szCs w:val="20"/>
-          <w:lang w:eastAsia="en-IN"/>
-          <w14:ligatures w14:val="none"/>
-        </w:rPr>
-        <w:t>": "2024-05-24T10:22:44.136Z",</w:t>
+        <w:t xml:space="preserve">    "createdAt": "2024-05-24T10:22:44.136Z",</w:t>
       </w:r>
     </w:p>
     <w:p>
@@ -2750,7 +2500,7 @@
           <w:lang w:eastAsia="en-IN"/>
           <w14:ligatures w14:val="none"/>
         </w:rPr>
-        <w:pict>
+        <w:pict w14:anchorId="59584372">
           <v:rect id="_x0000_i1029" style="width:0;height:1.5pt" o:hralign="center" o:hrstd="t" o:hr="t" fillcolor="#a0a0a0" stroked="f"/>
         </w:pict>
       </w:r>
@@ -3164,7 +2914,7 @@
           <w:lang w:eastAsia="en-IN"/>
           <w14:ligatures w14:val="none"/>
         </w:rPr>
-        <w:pict>
+        <w:pict w14:anchorId="2A205F5B">
           <v:rect id="_x0000_i1030" style="width:0;height:1.5pt" o:hralign="center" o:hrstd="t" o:hr="t" fillcolor="#a0a0a0" stroked="f"/>
         </w:pict>
       </w:r>
@@ -3257,34 +3007,8 @@
           <w:lang w:eastAsia="en-IN"/>
           <w14:ligatures w14:val="none"/>
         </w:rPr>
-        <w:t>/delete/machine</w:t>
-      </w:r>
-      <w:proofErr w:type="gramStart"/>
-      <w:r>
-        <w:rPr>
-          <w:rFonts w:ascii="Courier New" w:eastAsia="Times New Roman" w:hAnsi="Courier New" w:cs="Courier New"/>
-          <w:kern w:val="0"/>
-          <w:sz w:val="20"/>
-          <w:szCs w:val="20"/>
-          <w:lang w:eastAsia="en-IN"/>
-          <w14:ligatures w14:val="none"/>
-        </w:rPr>
-        <w:t>/:</w:t>
-      </w:r>
-      <w:proofErr w:type="spellStart"/>
-      <w:r>
-        <w:rPr>
-          <w:rFonts w:ascii="Courier New" w:eastAsia="Times New Roman" w:hAnsi="Courier New" w:cs="Courier New"/>
-          <w:kern w:val="0"/>
-          <w:sz w:val="20"/>
-          <w:szCs w:val="20"/>
-          <w:lang w:eastAsia="en-IN"/>
-          <w14:ligatures w14:val="none"/>
-        </w:rPr>
-        <w:t>machineCode</w:t>
-      </w:r>
-      <w:proofErr w:type="spellEnd"/>
-      <w:proofErr w:type="gramEnd"/>
+        <w:t>/delete/machine/:machineCode</w:t>
+      </w:r>
       <w:r>
         <w:rPr>
           <w:rFonts w:ascii="Times New Roman" w:eastAsia="Times New Roman" w:hAnsi="Times New Roman" w:cs="Times New Roman"/>
@@ -3605,7 +3329,7 @@
           <w:lang w:eastAsia="en-IN"/>
           <w14:ligatures w14:val="none"/>
         </w:rPr>
-        <w:pict>
+        <w:pict w14:anchorId="36F6F1F6">
           <v:rect id="_x0000_i1031" style="width:0;height:1.5pt" o:hralign="center" o:hrstd="t" o:hr="t" fillcolor="#a0a0a0" stroked="f"/>
         </w:pict>
       </w:r>
@@ -3847,7 +3571,7 @@
           <w:lang w:eastAsia="en-IN"/>
           <w14:ligatures w14:val="none"/>
         </w:rPr>
-        <w:pict>
+        <w:pict w14:anchorId="3AAD4448">
           <v:rect id="_x0000_i1032" style="width:0;height:1.5pt" o:hralign="center" o:hrstd="t" o:hr="t" fillcolor="#a0a0a0" stroked="f"/>
         </w:pict>
       </w:r>
@@ -4082,7 +3806,6 @@
         </w:rPr>
         <w:t xml:space="preserve">: </w:t>
       </w:r>
-      <w:proofErr w:type="spellStart"/>
       <w:r>
         <w:rPr>
           <w:rFonts w:ascii="Courier New" w:eastAsia="Times New Roman" w:hAnsi="Courier New" w:cs="Courier New"/>
@@ -4094,7 +3817,6 @@
         </w:rPr>
         <w:t>Skill_Matrix_Set_A</w:t>
       </w:r>
-      <w:proofErr w:type="spellEnd"/>
     </w:p>
     <w:p>
       <w:pPr>
@@ -4112,7 +3834,6 @@
           <w14:ligatures w14:val="none"/>
         </w:rPr>
       </w:pPr>
-      <w:proofErr w:type="spellStart"/>
       <w:r>
         <w:rPr>
           <w:rFonts w:ascii="Courier New" w:eastAsia="Times New Roman" w:hAnsi="Courier New" w:cs="Courier New"/>
@@ -4124,7 +3845,6 @@
         </w:rPr>
         <w:t>machineCode</w:t>
       </w:r>
-      <w:proofErr w:type="spellEnd"/>
       <w:r>
         <w:rPr>
           <w:rFonts w:ascii="Times New Roman" w:eastAsia="Times New Roman" w:hAnsi="Times New Roman" w:cs="Times New Roman"/>
@@ -4428,35 +4148,7 @@
           <w:lang w:eastAsia="en-IN"/>
           <w14:ligatures w14:val="none"/>
         </w:rPr>
-        <w:t xml:space="preserve"> Delete by </w:t>
-      </w:r>
-      <w:proofErr w:type="spellStart"/>
-      <w:r>
-        <w:rPr>
-          <w:rFonts w:ascii="Times New Roman" w:eastAsia="Times New Roman" w:hAnsi="Times New Roman" w:cs="Times New Roman"/>
-          <w:b/>
-          <w:bCs/>
-          <w:kern w:val="0"/>
-          <w:sz w:val="27"/>
-          <w:szCs w:val="27"/>
-          <w:lang w:eastAsia="en-IN"/>
-          <w14:ligatures w14:val="none"/>
-        </w:rPr>
-        <w:t>machineCode</w:t>
-      </w:r>
-      <w:proofErr w:type="spellEnd"/>
-      <w:r>
-        <w:rPr>
-          <w:rFonts w:ascii="Times New Roman" w:eastAsia="Times New Roman" w:hAnsi="Times New Roman" w:cs="Times New Roman"/>
-          <w:b/>
-          <w:bCs/>
-          <w:kern w:val="0"/>
-          <w:sz w:val="27"/>
-          <w:szCs w:val="27"/>
-          <w:lang w:eastAsia="en-IN"/>
-          <w14:ligatures w14:val="none"/>
-        </w:rPr>
-        <w:t>:</w:t>
+        <w:t xml:space="preserve"> Delete by machineCode:</w:t>
       </w:r>
     </w:p>
     <w:p>
@@ -4486,17 +4178,239 @@
         </w:rPr>
         <w:t xml:space="preserve">DELETE </w:t>
       </w:r>
-      <w:r>
-        <w:rPr>
-          <w:rFonts w:ascii="Courier New" w:eastAsia="Times New Roman" w:hAnsi="Courier New" w:cs="Courier New"/>
-          <w:kern w:val="0"/>
-          <w:sz w:val="20"/>
-          <w:szCs w:val="20"/>
-          <w:lang w:eastAsia="en-IN"/>
-          <w14:ligatures w14:val="none"/>
-        </w:rPr>
-        <w:t>http://localhost:5000/api/skillmatrix2p0/delete/machine/MACHINE001</w:t>
-      </w:r>
+      <w:hyperlink r:id="rId5" w:history="1">
+        <w:r>
+          <w:rPr>
+            <w:rStyle w:val="Hyperlink"/>
+            <w:rFonts w:ascii="Courier New" w:eastAsia="Times New Roman" w:hAnsi="Courier New" w:cs="Courier New"/>
+            <w:kern w:val="0"/>
+            <w:sz w:val="20"/>
+            <w:szCs w:val="20"/>
+            <w:lang w:eastAsia="en-IN"/>
+            <w14:ligatures w14:val="none"/>
+          </w:rPr>
+          <w:t>http://localhost:5000/api/skillmatrix2p0/delete/machine/MACHINE001</w:t>
+        </w:r>
+      </w:hyperlink>
+    </w:p>
+    <w:p>
+      <w:pPr>
+        <w:spacing w:before="100" w:beforeAutospacing="1" w:after="100" w:afterAutospacing="1" w:line="240" w:lineRule="auto"/>
+        <w:rPr>
+          <w:rFonts w:ascii="Times New Roman" w:eastAsia="Times New Roman" w:hAnsi="Times New Roman" w:cs="Times New Roman"/>
+          <w:kern w:val="0"/>
+          <w:sz w:val="24"/>
+          <w:szCs w:val="24"/>
+          <w:lang w:eastAsia="en-IN"/>
+          <w14:ligatures w14:val="none"/>
+        </w:rPr>
+      </w:pPr>
+    </w:p>
+    <w:p>
+      <w:pPr>
+        <w:pStyle w:val="Heading3"/>
+      </w:pPr>
+      <w:r>
+        <w:rPr>
+          <w:rFonts w:ascii="Segoe UI Emoji" w:hAnsi="Segoe UI Emoji" w:cs="Segoe UI Emoji"/>
+        </w:rPr>
+        <w:t>✅</w:t>
+      </w:r>
+      <w:r>
+        <w:t xml:space="preserve"> 3. </w:t>
+      </w:r>
+      <w:r>
+        <w:rPr>
+          <w:rStyle w:val="Strong"/>
+          <w:b/>
+          <w:bCs/>
+        </w:rPr>
+        <w:t>Test It</w:t>
+      </w:r>
+    </w:p>
+    <w:p>
+      <w:pPr>
+        <w:pStyle w:val="NormalWeb"/>
+        <w:numPr>
+          <w:ilvl w:val="0"/>
+          <w:numId w:val="9"/>
+        </w:numPr>
+      </w:pPr>
+      <w:r>
+        <w:rPr>
+          <w:rStyle w:val="Strong"/>
+        </w:rPr>
+        <w:t>Endpoint:</w:t>
+      </w:r>
+      <w:r>
+        <w:t xml:space="preserve"> </w:t>
+      </w:r>
+      <w:r>
+        <w:rPr>
+          <w:rStyle w:val="HTMLCode"/>
+        </w:rPr>
+        <w:t>DELETE /api/skillmatrix2p0/delete/id/:id</w:t>
+      </w:r>
+    </w:p>
+    <w:p>
+      <w:pPr>
+        <w:pStyle w:val="NormalWeb"/>
+        <w:numPr>
+          <w:ilvl w:val="0"/>
+          <w:numId w:val="9"/>
+        </w:numPr>
+      </w:pPr>
+      <w:r>
+        <w:rPr>
+          <w:rStyle w:val="Strong"/>
+        </w:rPr>
+        <w:t>Example:</w:t>
+      </w:r>
+    </w:p>
+    <w:p>
+      <w:pPr>
+        <w:pStyle w:val="HTMLPreformatted"/>
+        <w:ind w:left="720"/>
+      </w:pPr>
+      <w:r>
+        <w:t>bash</w:t>
+      </w:r>
+    </w:p>
+    <w:p>
+      <w:pPr>
+        <w:pStyle w:val="HTMLPreformatted"/>
+        <w:ind w:left="720"/>
+      </w:pPr>
+      <w:r>
+        <w:t>CopyEdit</w:t>
+      </w:r>
+    </w:p>
+    <w:p>
+      <w:pPr>
+        <w:pStyle w:val="HTMLPreformatted"/>
+        <w:ind w:left="720"/>
+        <w:rPr>
+          <w:rStyle w:val="HTMLCode"/>
+        </w:rPr>
+      </w:pPr>
+      <w:r>
+        <w:rPr>
+          <w:rStyle w:val="HTMLCode"/>
+        </w:rPr>
+        <w:t>DELETE /api/skillmatrix2p0/delete/id/665fbe01309cd06a9a123abc</w:t>
+      </w:r>
+    </w:p>
+    <w:p>
+      <w:pPr>
+        <w:pStyle w:val="NormalWeb"/>
+        <w:numPr>
+          <w:ilvl w:val="0"/>
+          <w:numId w:val="9"/>
+        </w:numPr>
+      </w:pPr>
+      <w:r>
+        <w:rPr>
+          <w:rStyle w:val="Strong"/>
+        </w:rPr>
+        <w:t>Response:</w:t>
+      </w:r>
+    </w:p>
+    <w:p>
+      <w:pPr>
+        <w:pStyle w:val="HTMLPreformatted"/>
+        <w:ind w:left="720"/>
+      </w:pPr>
+      <w:r>
+        <w:t>json</w:t>
+      </w:r>
+    </w:p>
+    <w:p>
+      <w:pPr>
+        <w:pStyle w:val="HTMLPreformatted"/>
+        <w:ind w:left="720"/>
+      </w:pPr>
+      <w:r>
+        <w:t>CopyEdit</w:t>
+      </w:r>
+    </w:p>
+    <w:p>
+      <w:pPr>
+        <w:pStyle w:val="HTMLPreformatted"/>
+        <w:ind w:left="720"/>
+        <w:rPr>
+          <w:rStyle w:val="HTMLCode"/>
+        </w:rPr>
+      </w:pPr>
+      <w:r>
+        <w:rPr>
+          <w:rStyle w:val="hljs-punctuation"/>
+        </w:rPr>
+        <w:t>{</w:t>
+      </w:r>
+    </w:p>
+    <w:p>
+      <w:pPr>
+        <w:pStyle w:val="HTMLPreformatted"/>
+        <w:ind w:left="720"/>
+        <w:rPr>
+          <w:rStyle w:val="HTMLCode"/>
+        </w:rPr>
+      </w:pPr>
+      <w:r>
+        <w:rPr>
+          <w:rStyle w:val="HTMLCode"/>
+        </w:rPr>
+        <w:t xml:space="preserve">  </w:t>
+      </w:r>
+      <w:r>
+        <w:rPr>
+          <w:rStyle w:val="hljs-attr"/>
+        </w:rPr>
+        <w:t>"message"</w:t>
+      </w:r>
+      <w:r>
+        <w:rPr>
+          <w:rStyle w:val="hljs-punctuation"/>
+        </w:rPr>
+        <w:t>:</w:t>
+      </w:r>
+      <w:r>
+        <w:rPr>
+          <w:rStyle w:val="HTMLCode"/>
+        </w:rPr>
+        <w:t xml:space="preserve"> </w:t>
+      </w:r>
+      <w:r>
+        <w:rPr>
+          <w:rStyle w:val="hljs-string"/>
+        </w:rPr>
+        <w:t>"Skill matrix entry deleted successfully by ID"</w:t>
+      </w:r>
+    </w:p>
+    <w:p>
+      <w:pPr>
+        <w:pStyle w:val="HTMLPreformatted"/>
+        <w:ind w:left="720"/>
+      </w:pPr>
+      <w:r>
+        <w:rPr>
+          <w:rStyle w:val="hljs-punctuation"/>
+        </w:rPr>
+        <w:t>}</w:t>
+      </w:r>
+    </w:p>
+    <w:p>
+      <w:pPr>
+        <w:spacing w:before="100" w:beforeAutospacing="1" w:after="100" w:afterAutospacing="1" w:line="240" w:lineRule="auto"/>
+        <w:rPr>
+          <w:rFonts w:ascii="Times New Roman" w:eastAsia="Times New Roman" w:hAnsi="Times New Roman" w:cs="Times New Roman"/>
+          <w:kern w:val="0"/>
+          <w:sz w:val="24"/>
+          <w:szCs w:val="24"/>
+          <w:lang w:eastAsia="en-IN"/>
+          <w14:ligatures w14:val="none"/>
+        </w:rPr>
+      </w:pPr>
     </w:p>
     <w:p>
       <w:pPr>
@@ -4519,7 +4433,7 @@
           <w:lang w:eastAsia="en-IN"/>
           <w14:ligatures w14:val="none"/>
         </w:rPr>
-        <w:pict>
+        <w:pict w14:anchorId="242156CC">
           <v:rect id="_x0000_i1033" style="width:0;height:1.5pt" o:hralign="center" o:hrstd="t" o:hr="t" fillcolor="#a0a0a0" stroked="f"/>
         </w:pict>
       </w:r>
@@ -5009,6 +4923,155 @@
     </w:lvl>
   </w:abstractNum>
   <w:abstractNum w:abstractNumId="3" w15:restartNumberingAfterBreak="0">
+    <w:nsid w:val="3C64779E"/>
+    <w:multiLevelType w:val="multilevel"/>
+    <w:tmpl w:val="5B844C8A"/>
+    <w:lvl w:ilvl="0">
+      <w:start w:val="1"/>
+      <w:numFmt w:val="bullet"/>
+      <w:lvlText w:val=""/>
+      <w:lvlJc w:val="left"/>
+      <w:pPr>
+        <w:tabs>
+          <w:tab w:val="num" w:pos="720"/>
+        </w:tabs>
+        <w:ind w:left="720" w:hanging="360"/>
+      </w:pPr>
+      <w:rPr>
+        <w:rFonts w:ascii="Symbol" w:hAnsi="Symbol" w:hint="default"/>
+        <w:sz w:val="20"/>
+      </w:rPr>
+    </w:lvl>
+    <w:lvl w:ilvl="1" w:tentative="1">
+      <w:start w:val="1"/>
+      <w:numFmt w:val="bullet"/>
+      <w:lvlText w:val="o"/>
+      <w:lvlJc w:val="left"/>
+      <w:pPr>
+        <w:tabs>
+          <w:tab w:val="num" w:pos="1440"/>
+        </w:tabs>
+        <w:ind w:left="1440" w:hanging="360"/>
+      </w:pPr>
+      <w:rPr>
+        <w:rFonts w:ascii="Courier New" w:hAnsi="Courier New" w:hint="default"/>
+        <w:sz w:val="20"/>
+      </w:rPr>
+    </w:lvl>
+    <w:lvl w:ilvl="2" w:tentative="1">
+      <w:start w:val="1"/>
+      <w:numFmt w:val="bullet"/>
+      <w:lvlText w:val=""/>
+      <w:lvlJc w:val="left"/>
+      <w:pPr>
+        <w:tabs>
+          <w:tab w:val="num" w:pos="2160"/>
+        </w:tabs>
+        <w:ind w:left="2160" w:hanging="360"/>
+      </w:pPr>
+      <w:rPr>
+        <w:rFonts w:ascii="Wingdings" w:hAnsi="Wingdings" w:hint="default"/>
+        <w:sz w:val="20"/>
+      </w:rPr>
+    </w:lvl>
+    <w:lvl w:ilvl="3" w:tentative="1">
+      <w:start w:val="1"/>
+      <w:numFmt w:val="bullet"/>
+      <w:lvlText w:val=""/>
+      <w:lvlJc w:val="left"/>
+      <w:pPr>
+        <w:tabs>
+          <w:tab w:val="num" w:pos="2880"/>
+        </w:tabs>
+        <w:ind w:left="2880" w:hanging="360"/>
+      </w:pPr>
+      <w:rPr>
+        <w:rFonts w:ascii="Wingdings" w:hAnsi="Wingdings" w:hint="default"/>
+        <w:sz w:val="20"/>
+      </w:rPr>
+    </w:lvl>
+    <w:lvl w:ilvl="4" w:tentative="1">
+      <w:start w:val="1"/>
+      <w:numFmt w:val="bullet"/>
+      <w:lvlText w:val=""/>
+      <w:lvlJc w:val="left"/>
+      <w:pPr>
+        <w:tabs>
+          <w:tab w:val="num" w:pos="3600"/>
+        </w:tabs>
+        <w:ind w:left="3600" w:hanging="360"/>
+      </w:pPr>
+      <w:rPr>
+        <w:rFonts w:ascii="Wingdings" w:hAnsi="Wingdings" w:hint="default"/>
+        <w:sz w:val="20"/>
+      </w:rPr>
+    </w:lvl>
+    <w:lvl w:ilvl="5" w:tentative="1">
+      <w:start w:val="1"/>
+      <w:numFmt w:val="bullet"/>
+      <w:lvlText w:val=""/>
+      <w:lvlJc w:val="left"/>
+      <w:pPr>
+        <w:tabs>
+          <w:tab w:val="num" w:pos="4320"/>
+        </w:tabs>
+        <w:ind w:left="4320" w:hanging="360"/>
+      </w:pPr>
+      <w:rPr>
+        <w:rFonts w:ascii="Wingdings" w:hAnsi="Wingdings" w:hint="default"/>
+        <w:sz w:val="20"/>
+      </w:rPr>
+    </w:lvl>
+    <w:lvl w:ilvl="6" w:tentative="1">
+      <w:start w:val="1"/>
+      <w:numFmt w:val="bullet"/>
+      <w:lvlText w:val=""/>
+      <w:lvlJc w:val="left"/>
+      <w:pPr>
+        <w:tabs>
+          <w:tab w:val="num" w:pos="5040"/>
+        </w:tabs>
+        <w:ind w:left="5040" w:hanging="360"/>
+      </w:pPr>
+      <w:rPr>
+        <w:rFonts w:ascii="Wingdings" w:hAnsi="Wingdings" w:hint="default"/>
+        <w:sz w:val="20"/>
+      </w:rPr>
+    </w:lvl>
+    <w:lvl w:ilvl="7" w:tentative="1">
+      <w:start w:val="1"/>
+      <w:numFmt w:val="bullet"/>
+      <w:lvlText w:val=""/>
+      <w:lvlJc w:val="left"/>
+      <w:pPr>
+        <w:tabs>
+          <w:tab w:val="num" w:pos="5760"/>
+        </w:tabs>
+        <w:ind w:left="5760" w:hanging="360"/>
+      </w:pPr>
+      <w:rPr>
+        <w:rFonts w:ascii="Wingdings" w:hAnsi="Wingdings" w:hint="default"/>
+        <w:sz w:val="20"/>
+      </w:rPr>
+    </w:lvl>
+    <w:lvl w:ilvl="8" w:tentative="1">
+      <w:start w:val="1"/>
+      <w:numFmt w:val="bullet"/>
+      <w:lvlText w:val=""/>
+      <w:lvlJc w:val="left"/>
+      <w:pPr>
+        <w:tabs>
+          <w:tab w:val="num" w:pos="6480"/>
+        </w:tabs>
+        <w:ind w:left="6480" w:hanging="360"/>
+      </w:pPr>
+      <w:rPr>
+        <w:rFonts w:ascii="Wingdings" w:hAnsi="Wingdings" w:hint="default"/>
+        <w:sz w:val="20"/>
+      </w:rPr>
+    </w:lvl>
+  </w:abstractNum>
+  <w:abstractNum w:abstractNumId="4" w15:restartNumberingAfterBreak="0">
     <w:nsid w:val="44C32B42"/>
     <w:multiLevelType w:val="multilevel"/>
     <w:tmpl w:val="7A36E6E8"/>
@@ -5125,7 +5188,7 @@
       </w:pPr>
     </w:lvl>
   </w:abstractNum>
-  <w:abstractNum w:abstractNumId="4" w15:restartNumberingAfterBreak="0">
+  <w:abstractNum w:abstractNumId="5" w15:restartNumberingAfterBreak="0">
     <w:nsid w:val="4B606DCD"/>
     <w:multiLevelType w:val="multilevel"/>
     <w:tmpl w:val="549A0BCE"/>
@@ -5274,7 +5337,7 @@
       </w:rPr>
     </w:lvl>
   </w:abstractNum>
-  <w:abstractNum w:abstractNumId="5" w15:restartNumberingAfterBreak="0">
+  <w:abstractNum w:abstractNumId="6" w15:restartNumberingAfterBreak="0">
     <w:nsid w:val="5B80080A"/>
     <w:multiLevelType w:val="multilevel"/>
     <w:tmpl w:val="4B463E7E"/>
@@ -5423,7 +5486,7 @@
       </w:rPr>
     </w:lvl>
   </w:abstractNum>
-  <w:abstractNum w:abstractNumId="6" w15:restartNumberingAfterBreak="0">
+  <w:abstractNum w:abstractNumId="7" w15:restartNumberingAfterBreak="0">
     <w:nsid w:val="62E125B9"/>
     <w:multiLevelType w:val="multilevel"/>
     <w:tmpl w:val="A5E6D76E"/>
@@ -5572,7 +5635,7 @@
       </w:rPr>
     </w:lvl>
   </w:abstractNum>
-  <w:abstractNum w:abstractNumId="7" w15:restartNumberingAfterBreak="0">
+  <w:abstractNum w:abstractNumId="8" w15:restartNumberingAfterBreak="0">
     <w:nsid w:val="71163B6C"/>
     <w:multiLevelType w:val="multilevel"/>
     <w:tmpl w:val="D9F668F4"/>
@@ -5722,28 +5785,31 @@
     </w:lvl>
   </w:abstractNum>
   <w:num w:numId="1" w16cid:durableId="670522112">
-    <w:abstractNumId w:val="7"/>
+    <w:abstractNumId w:val="8"/>
   </w:num>
   <w:num w:numId="2" w16cid:durableId="1606376083">
-    <w:abstractNumId w:val="5"/>
+    <w:abstractNumId w:val="6"/>
   </w:num>
   <w:num w:numId="3" w16cid:durableId="6450842">
-    <w:abstractNumId w:val="6"/>
+    <w:abstractNumId w:val="7"/>
   </w:num>
   <w:num w:numId="4" w16cid:durableId="1635594851">
     <w:abstractNumId w:val="0"/>
   </w:num>
   <w:num w:numId="5" w16cid:durableId="1347176603">
-    <w:abstractNumId w:val="3"/>
+    <w:abstractNumId w:val="4"/>
   </w:num>
   <w:num w:numId="6" w16cid:durableId="634413795">
     <w:abstractNumId w:val="1"/>
   </w:num>
   <w:num w:numId="7" w16cid:durableId="2016034869">
-    <w:abstractNumId w:val="4"/>
+    <w:abstractNumId w:val="5"/>
   </w:num>
   <w:num w:numId="8" w16cid:durableId="2091073609">
     <w:abstractNumId w:val="2"/>
+  </w:num>
+  <w:num w:numId="9" w16cid:durableId="311566697">
+    <w:abstractNumId w:val="3"/>
   </w:num>
 </w:numbering>
 </file>
@@ -6351,6 +6417,44 @@
       <w:szCs w:val="20"/>
     </w:rPr>
   </w:style>
+  <w:style w:type="character" w:styleId="Hyperlink">
+    <w:name w:val="Hyperlink"/>
+    <w:basedOn w:val="DefaultParagraphFont"/>
+    <w:uiPriority w:val="99"/>
+    <w:unhideWhenUsed/>
+    <w:rsid w:val="0063150C"/>
+    <w:rPr>
+      <w:color w:val="0563C1" w:themeColor="hyperlink"/>
+      <w:u w:val="single"/>
+    </w:rPr>
+  </w:style>
+  <w:style w:type="character" w:styleId="UnresolvedMention">
+    <w:name w:val="Unresolved Mention"/>
+    <w:basedOn w:val="DefaultParagraphFont"/>
+    <w:uiPriority w:val="99"/>
+    <w:semiHidden/>
+    <w:unhideWhenUsed/>
+    <w:rsid w:val="0063150C"/>
+    <w:rPr>
+      <w:color w:val="605E5C"/>
+      <w:shd w:val="clear" w:color="auto" w:fill="E1DFDD"/>
+    </w:rPr>
+  </w:style>
+  <w:style w:type="character" w:customStyle="1" w:styleId="hljs-punctuation">
+    <w:name w:val="hljs-punctuation"/>
+    <w:basedOn w:val="DefaultParagraphFont"/>
+    <w:rsid w:val="0063150C"/>
+  </w:style>
+  <w:style w:type="character" w:customStyle="1" w:styleId="hljs-attr">
+    <w:name w:val="hljs-attr"/>
+    <w:basedOn w:val="DefaultParagraphFont"/>
+    <w:rsid w:val="0063150C"/>
+  </w:style>
+  <w:style w:type="character" w:customStyle="1" w:styleId="hljs-string">
+    <w:name w:val="hljs-string"/>
+    <w:basedOn w:val="DefaultParagraphFont"/>
+    <w:rsid w:val="0063150C"/>
+  </w:style>
 </w:styles>
 </file>
 

</xml_diff>